<commit_message>
chore: update offer generator document for ALAN BIJO VARGHESE
</commit_message>
<xml_diff>
--- a/ALAN BIJO VARGHESE.docx
+++ b/ALAN BIJO VARGHESE.docx
@@ -267,45 +267,125 @@
     <w:p>
       <w:pPr>
         <w:pStyle w:val="Heading1"/>
-        <w:ind w:left="8020" w:firstLine="620"/>
-      </w:pPr>
-      <w:r>
-        <w:t xml:space="preserve">         </w:t>
-      </w:r>
-      <w:r>
-        <w:t xml:space="preserve"> </w:t>
-      </w:r>
-      <w:r>
+        <w:rPr>
+          <w:sz w:val="22"/>
+          <w:szCs w:val="22"/>
+        </w:rPr>
+      </w:pPr>
+      <w:r>
+        <w:rPr>
+          <w:sz w:val="22"/>
+          <w:szCs w:val="22"/>
+        </w:rPr>
+        <w:t xml:space="preserve">To                                                                                                                           </w:t>
+      </w:r>
+      <w:r>
+        <w:rPr>
+          <w:sz w:val="22"/>
+          <w:szCs w:val="22"/>
+        </w:rPr>
+        <w:t xml:space="preserve">     </w:t>
+      </w:r>
+      <w:r>
+        <w:rPr>
+          <w:sz w:val="22"/>
+          <w:szCs w:val="22"/>
+        </w:rPr>
+        <w:t xml:space="preserve"> </w:t>
+      </w:r>
+      <w:r>
+        <w:rPr>
+          <w:sz w:val="22"/>
+          <w:szCs w:val="22"/>
+        </w:rPr>
         <w:t>DATE:</w:t>
       </w:r>
     </w:p>
     <w:p>
       <w:pPr>
         <w:pStyle w:val="Heading1"/>
-      </w:pPr>
+        <w:rPr>
+          <w:sz w:val="22"/>
+          <w:szCs w:val="22"/>
+        </w:rPr>
+      </w:pPr>
+      <w:r>
+        <w:rPr>
+          <w:sz w:val="22"/>
+          <w:szCs w:val="22"/>
+        </w:rPr>
+        <w:t>ALAN</w:t>
+      </w:r>
+      <w:r>
+        <w:rPr>
+          <w:spacing w:val="16"/>
+          <w:sz w:val="22"/>
+          <w:szCs w:val="22"/>
+        </w:rPr>
+        <w:t xml:space="preserve"> </w:t>
+      </w:r>
+      <w:r>
+        <w:rPr>
+          <w:sz w:val="22"/>
+          <w:szCs w:val="22"/>
+        </w:rPr>
+        <w:t>BIJO</w:t>
+      </w:r>
+      <w:r>
+        <w:rPr>
+          <w:spacing w:val="16"/>
+          <w:sz w:val="22"/>
+          <w:szCs w:val="22"/>
+        </w:rPr>
+        <w:t xml:space="preserve"> </w:t>
+      </w:r>
+      <w:r>
+        <w:rPr>
+          <w:spacing w:val="-2"/>
+          <w:sz w:val="22"/>
+          <w:szCs w:val="22"/>
+        </w:rPr>
+        <w:t>VARGHESE</w:t>
+      </w:r>
       <w:r>
         <w:rPr>
           <w:w w:val="115"/>
-        </w:rPr>
-        <w:t xml:space="preserve">                                                                                                   </w:t>
+          <w:sz w:val="22"/>
+          <w:szCs w:val="22"/>
+        </w:rPr>
+        <w:t xml:space="preserve">     </w:t>
       </w:r>
       <w:r>
         <w:rPr>
           <w:w w:val="115"/>
+          <w:sz w:val="22"/>
+          <w:szCs w:val="22"/>
+        </w:rPr>
+        <w:t xml:space="preserve">                                                                           </w:t>
+      </w:r>
+      <w:r>
+        <w:rPr>
+          <w:w w:val="115"/>
+          <w:sz w:val="22"/>
+          <w:szCs w:val="22"/>
         </w:rPr>
         <w:t>11/05/2026</w:t>
       </w:r>
-    </w:p>
-    <w:p>
-      <w:pPr>
-        <w:pStyle w:val="Heading1"/>
-        <w:ind w:left="0"/>
-      </w:pPr>
-      <w:r>
-        <w:t xml:space="preserve">          </w:t>
-      </w:r>
-      <w:r>
-        <w:t>To</w:t>
+      <w:r>
+        <w:rPr>
+          <w:w w:val="115"/>
+          <w:sz w:val="22"/>
+          <w:szCs w:val="22"/>
+        </w:rPr>
+        <w:t xml:space="preserve">                                                                                              </w:t>
+      </w:r>
+      <w:r>
+        <w:rPr>
+          <w:w w:val="115"/>
+          <w:sz w:val="22"/>
+          <w:szCs w:val="22"/>
+        </w:rPr>
+        <w:t xml:space="preserve">            </w:t>
       </w:r>
     </w:p>
     <w:p>
@@ -321,46 +401,6 @@
         </w:rPr>
         <w:t xml:space="preserve">             </w:t>
       </w:r>
-      <w:r>
-        <w:rPr>
-          <w:b/>
-        </w:rPr>
-        <w:t>ALAN</w:t>
-      </w:r>
-      <w:r>
-        <w:rPr>
-          <w:b/>
-          <w:spacing w:val="16"/>
-        </w:rPr>
-        <w:t xml:space="preserve"> </w:t>
-      </w:r>
-      <w:r>
-        <w:rPr>
-          <w:b/>
-        </w:rPr>
-        <w:t>BIJO</w:t>
-      </w:r>
-      <w:r>
-        <w:rPr>
-          <w:b/>
-          <w:spacing w:val="16"/>
-        </w:rPr>
-        <w:t xml:space="preserve"> </w:t>
-      </w:r>
-      <w:r>
-        <w:rPr>
-          <w:b/>
-          <w:spacing w:val="-2"/>
-        </w:rPr>
-        <w:t>VARGHESE</w:t>
-      </w:r>
-    </w:p>
-    <w:p>
-      <w:pPr>
-        <w:pStyle w:val="Heading2"/>
-        <w:ind w:left="818"/>
-        <w:jc w:val="left"/>
-      </w:pPr>
       <w:r>
         <w:rPr>
           <w:w w:val="105"/>
@@ -440,6 +480,18 @@
         <w:rPr>
           <w:b/>
           <w:sz w:val="24"/>
+          <w:u w:val="thick"/>
+        </w:rPr>
+      </w:pPr>
+    </w:p>
+    <w:p>
+      <w:pPr>
+        <w:spacing w:before="92"/>
+        <w:ind w:left="837" w:right="891"/>
+        <w:jc w:val="center"/>
+        <w:rPr>
+          <w:b/>
+          <w:sz w:val="24"/>
         </w:rPr>
       </w:pPr>
       <w:proofErr w:type="spellStart"/>
@@ -520,10 +572,16 @@
         <w:spacing w:line="314" w:lineRule="auto"/>
         <w:ind w:left="1154" w:right="802"/>
         <w:jc w:val="both"/>
-      </w:pPr>
-      <w:r>
-        <w:rPr>
-          <w:w w:val="110"/>
+        <w:rPr>
+          <w:sz w:val="22"/>
+          <w:szCs w:val="22"/>
+        </w:rPr>
+      </w:pPr>
+      <w:r>
+        <w:rPr>
+          <w:w w:val="110"/>
+          <w:sz w:val="22"/>
+          <w:szCs w:val="22"/>
         </w:rPr>
         <w:t xml:space="preserve">Dear </w:t>
       </w:r>
@@ -532,6 +590,7 @@
           <w:b/>
           <w:w w:val="110"/>
           <w:sz w:val="22"/>
+          <w:szCs w:val="22"/>
         </w:rPr>
         <w:t xml:space="preserve">ALAN BIJO </w:t>
       </w:r>
@@ -541,21 +600,15 @@
           <w:b/>
           <w:w w:val="110"/>
           <w:sz w:val="22"/>
-        </w:rPr>
-        <w:t>VARGHESE</w:t>
-      </w:r>
-      <w:r>
-        <w:rPr>
-          <w:b/>
-          <w:w w:val="110"/>
-          <w:sz w:val="22"/>
-        </w:rPr>
-        <w:t xml:space="preserve"> </w:t>
-      </w:r>
-      <w:r>
-        <w:rPr>
-          <w:w w:val="110"/>
-          <w:sz w:val="22"/>
+          <w:szCs w:val="22"/>
+        </w:rPr>
+        <w:t xml:space="preserve">VARGHESE </w:t>
+      </w:r>
+      <w:r>
+        <w:rPr>
+          <w:w w:val="110"/>
+          <w:sz w:val="22"/>
+          <w:szCs w:val="22"/>
         </w:rPr>
         <w:t>,</w:t>
       </w:r>
@@ -564,25 +617,24 @@
         <w:rPr>
           <w:w w:val="110"/>
           <w:sz w:val="22"/>
-        </w:rPr>
-        <w:t xml:space="preserve"> </w:t>
-      </w:r>
-      <w:r>
-        <w:rPr>
-          <w:w w:val="110"/>
-        </w:rPr>
-        <w:t>we are pleased to offer you internship at Vibrant Technology in the</w:t>
+          <w:szCs w:val="22"/>
+        </w:rPr>
+        <w:t xml:space="preserve"> we are pleased to offer you internship at Vibrant Technology in the</w:t>
       </w:r>
       <w:r>
         <w:rPr>
           <w:spacing w:val="31"/>
           <w:w w:val="110"/>
-        </w:rPr>
-        <w:t xml:space="preserve"> </w:t>
-      </w:r>
-      <w:r>
-        <w:rPr>
-          <w:w w:val="110"/>
+          <w:sz w:val="22"/>
+          <w:szCs w:val="22"/>
+        </w:rPr>
+        <w:t xml:space="preserve"> </w:t>
+      </w:r>
+      <w:r>
+        <w:rPr>
+          <w:w w:val="110"/>
+          <w:sz w:val="22"/>
+          <w:szCs w:val="22"/>
         </w:rPr>
         <w:t xml:space="preserve">domain of </w:t>
       </w:r>
@@ -590,12 +642,16 @@
         <w:rPr>
           <w:b/>
           <w:w w:val="110"/>
+          <w:sz w:val="22"/>
+          <w:szCs w:val="22"/>
         </w:rPr>
         <w:t xml:space="preserve">Data Science. </w:t>
       </w:r>
       <w:r>
         <w:rPr>
           <w:w w:val="110"/>
+          <w:sz w:val="22"/>
+          <w:szCs w:val="22"/>
         </w:rPr>
         <w:t>Your internship will be from</w:t>
       </w:r>
@@ -603,12 +659,16 @@
         <w:rPr>
           <w:spacing w:val="-11"/>
           <w:w w:val="110"/>
-        </w:rPr>
-        <w:t xml:space="preserve"> </w:t>
-      </w:r>
-      <w:r>
-        <w:rPr>
-          <w:w w:val="110"/>
+          <w:sz w:val="22"/>
+          <w:szCs w:val="22"/>
+        </w:rPr>
+        <w:t xml:space="preserve"> </w:t>
+      </w:r>
+      <w:r>
+        <w:rPr>
+          <w:w w:val="110"/>
+          <w:sz w:val="22"/>
+          <w:szCs w:val="22"/>
         </w:rPr>
         <w:t>11/05/2026 to 11/08/2026 with flexible timings. During this period, you will gain practical experience</w:t>
       </w:r>
@@ -616,12 +676,16 @@
         <w:rPr>
           <w:spacing w:val="40"/>
           <w:w w:val="110"/>
-        </w:rPr>
-        <w:t xml:space="preserve"> </w:t>
-      </w:r>
-      <w:r>
-        <w:rPr>
-          <w:w w:val="110"/>
+          <w:sz w:val="22"/>
+          <w:szCs w:val="22"/>
+        </w:rPr>
+        <w:t xml:space="preserve"> </w:t>
+      </w:r>
+      <w:r>
+        <w:rPr>
+          <w:w w:val="110"/>
+          <w:sz w:val="22"/>
+          <w:szCs w:val="22"/>
         </w:rPr>
         <w:t>through live projects and</w:t>
       </w:r>
@@ -629,12 +693,16 @@
         <w:rPr>
           <w:spacing w:val="40"/>
           <w:w w:val="110"/>
-        </w:rPr>
-        <w:t xml:space="preserve"> </w:t>
-      </w:r>
-      <w:r>
-        <w:rPr>
-          <w:w w:val="110"/>
+          <w:sz w:val="22"/>
+          <w:szCs w:val="22"/>
+        </w:rPr>
+        <w:t xml:space="preserve"> </w:t>
+      </w:r>
+      <w:r>
+        <w:rPr>
+          <w:w w:val="110"/>
+          <w:sz w:val="22"/>
+          <w:szCs w:val="22"/>
         </w:rPr>
         <w:t>guidance</w:t>
       </w:r>
@@ -642,12 +710,16 @@
         <w:rPr>
           <w:spacing w:val="40"/>
           <w:w w:val="110"/>
-        </w:rPr>
-        <w:t xml:space="preserve"> </w:t>
-      </w:r>
-      <w:r>
-        <w:rPr>
-          <w:w w:val="110"/>
+          <w:sz w:val="22"/>
+          <w:szCs w:val="22"/>
+        </w:rPr>
+        <w:t xml:space="preserve"> </w:t>
+      </w:r>
+      <w:r>
+        <w:rPr>
+          <w:w w:val="110"/>
+          <w:sz w:val="22"/>
+          <w:szCs w:val="22"/>
         </w:rPr>
         <w:t>from our mentors. This internship is for training purposes.</w:t>
       </w:r>
@@ -657,7 +729,8 @@
         <w:pStyle w:val="BodyText"/>
         <w:spacing w:before="9"/>
         <w:rPr>
-          <w:sz w:val="30"/>
+          <w:sz w:val="22"/>
+          <w:szCs w:val="22"/>
         </w:rPr>
       </w:pPr>
     </w:p>
@@ -666,10 +739,16 @@
         <w:pStyle w:val="BodyText"/>
         <w:spacing w:before="1"/>
         <w:ind w:left="1150"/>
-      </w:pPr>
-      <w:r>
-        <w:rPr>
-          <w:w w:val="110"/>
+        <w:rPr>
+          <w:sz w:val="22"/>
+          <w:szCs w:val="22"/>
+        </w:rPr>
+      </w:pPr>
+      <w:r>
+        <w:rPr>
+          <w:w w:val="110"/>
+          <w:sz w:val="22"/>
+          <w:szCs w:val="22"/>
         </w:rPr>
         <w:t>I</w:t>
       </w:r>
@@ -677,12 +756,16 @@
         <w:rPr>
           <w:spacing w:val="-8"/>
           <w:w w:val="110"/>
-        </w:rPr>
-        <w:t xml:space="preserve"> </w:t>
-      </w:r>
-      <w:r>
-        <w:rPr>
-          <w:w w:val="110"/>
+          <w:sz w:val="22"/>
+          <w:szCs w:val="22"/>
+        </w:rPr>
+        <w:t xml:space="preserve"> </w:t>
+      </w:r>
+      <w:r>
+        <w:rPr>
+          <w:w w:val="110"/>
+          <w:sz w:val="22"/>
+          <w:szCs w:val="22"/>
         </w:rPr>
         <w:t>welcome</w:t>
       </w:r>
@@ -690,12 +773,16 @@
         <w:rPr>
           <w:spacing w:val="16"/>
           <w:w w:val="110"/>
-        </w:rPr>
-        <w:t xml:space="preserve"> </w:t>
-      </w:r>
-      <w:r>
-        <w:rPr>
-          <w:w w:val="110"/>
+          <w:sz w:val="22"/>
+          <w:szCs w:val="22"/>
+        </w:rPr>
+        <w:t xml:space="preserve"> </w:t>
+      </w:r>
+      <w:r>
+        <w:rPr>
+          <w:w w:val="110"/>
+          <w:sz w:val="22"/>
+          <w:szCs w:val="22"/>
         </w:rPr>
         <w:t>to</w:t>
       </w:r>
@@ -703,12 +790,16 @@
         <w:rPr>
           <w:spacing w:val="16"/>
           <w:w w:val="110"/>
-        </w:rPr>
-        <w:t xml:space="preserve"> </w:t>
-      </w:r>
-      <w:r>
-        <w:rPr>
-          <w:w w:val="110"/>
+          <w:sz w:val="22"/>
+          <w:szCs w:val="22"/>
+        </w:rPr>
+        <w:t xml:space="preserve"> </w:t>
+      </w:r>
+      <w:r>
+        <w:rPr>
+          <w:w w:val="110"/>
+          <w:sz w:val="22"/>
+          <w:szCs w:val="22"/>
         </w:rPr>
         <w:t>you</w:t>
       </w:r>
@@ -716,12 +807,16 @@
         <w:rPr>
           <w:spacing w:val="-1"/>
           <w:w w:val="110"/>
-        </w:rPr>
-        <w:t xml:space="preserve"> </w:t>
-      </w:r>
-      <w:r>
-        <w:rPr>
-          <w:w w:val="110"/>
+          <w:sz w:val="22"/>
+          <w:szCs w:val="22"/>
+        </w:rPr>
+        <w:t xml:space="preserve"> </w:t>
+      </w:r>
+      <w:r>
+        <w:rPr>
+          <w:w w:val="110"/>
+          <w:sz w:val="22"/>
+          <w:szCs w:val="22"/>
         </w:rPr>
         <w:t>on</w:t>
       </w:r>
@@ -729,12 +824,16 @@
         <w:rPr>
           <w:spacing w:val="5"/>
           <w:w w:val="110"/>
-        </w:rPr>
-        <w:t xml:space="preserve"> </w:t>
-      </w:r>
-      <w:r>
-        <w:rPr>
-          <w:w w:val="110"/>
+          <w:sz w:val="22"/>
+          <w:szCs w:val="22"/>
+        </w:rPr>
+        <w:t xml:space="preserve"> </w:t>
+      </w:r>
+      <w:r>
+        <w:rPr>
+          <w:w w:val="110"/>
+          <w:sz w:val="22"/>
+          <w:szCs w:val="22"/>
         </w:rPr>
         <w:t>the</w:t>
       </w:r>
@@ -742,12 +841,16 @@
         <w:rPr>
           <w:spacing w:val="11"/>
           <w:w w:val="110"/>
-        </w:rPr>
-        <w:t xml:space="preserve"> </w:t>
-      </w:r>
-      <w:r>
-        <w:rPr>
-          <w:w w:val="110"/>
+          <w:sz w:val="22"/>
+          <w:szCs w:val="22"/>
+        </w:rPr>
+        <w:t xml:space="preserve"> </w:t>
+      </w:r>
+      <w:r>
+        <w:rPr>
+          <w:w w:val="110"/>
+          <w:sz w:val="22"/>
+          <w:szCs w:val="22"/>
         </w:rPr>
         <w:t>behalf</w:t>
       </w:r>
@@ -755,12 +858,16 @@
         <w:rPr>
           <w:spacing w:val="30"/>
           <w:w w:val="110"/>
-        </w:rPr>
-        <w:t xml:space="preserve"> </w:t>
-      </w:r>
-      <w:r>
-        <w:rPr>
-          <w:w w:val="110"/>
+          <w:sz w:val="22"/>
+          <w:szCs w:val="22"/>
+        </w:rPr>
+        <w:t xml:space="preserve"> </w:t>
+      </w:r>
+      <w:r>
+        <w:rPr>
+          <w:w w:val="110"/>
+          <w:sz w:val="22"/>
+          <w:szCs w:val="22"/>
         </w:rPr>
         <w:t>of</w:t>
       </w:r>
@@ -768,12 +875,16 @@
         <w:rPr>
           <w:spacing w:val="22"/>
           <w:w w:val="110"/>
-        </w:rPr>
-        <w:t xml:space="preserve"> </w:t>
-      </w:r>
-      <w:r>
-        <w:rPr>
-          <w:w w:val="110"/>
+          <w:sz w:val="22"/>
+          <w:szCs w:val="22"/>
+        </w:rPr>
+        <w:t xml:space="preserve"> </w:t>
+      </w:r>
+      <w:r>
+        <w:rPr>
+          <w:w w:val="110"/>
+          <w:sz w:val="22"/>
+          <w:szCs w:val="22"/>
         </w:rPr>
         <w:t>Vibrant</w:t>
       </w:r>
@@ -781,6 +892,8 @@
         <w:rPr>
           <w:spacing w:val="29"/>
           <w:w w:val="110"/>
+          <w:sz w:val="22"/>
+          <w:szCs w:val="22"/>
         </w:rPr>
         <w:t xml:space="preserve"> </w:t>
       </w:r>
@@ -788,6 +901,8 @@
         <w:rPr>
           <w:spacing w:val="-2"/>
           <w:w w:val="110"/>
+          <w:sz w:val="22"/>
+          <w:szCs w:val="22"/>
         </w:rPr>
         <w:t>Technology.</w:t>
       </w:r>
@@ -797,10 +912,16 @@
         <w:pStyle w:val="BodyText"/>
         <w:spacing w:before="84"/>
         <w:ind w:left="1150"/>
-      </w:pPr>
-      <w:r>
-        <w:rPr>
-          <w:w w:val="110"/>
+        <w:rPr>
+          <w:sz w:val="22"/>
+          <w:szCs w:val="22"/>
+        </w:rPr>
+      </w:pPr>
+      <w:r>
+        <w:rPr>
+          <w:w w:val="110"/>
+          <w:sz w:val="22"/>
+          <w:szCs w:val="22"/>
         </w:rPr>
         <w:t>I</w:t>
       </w:r>
@@ -808,12 +929,16 @@
         <w:rPr>
           <w:spacing w:val="-12"/>
           <w:w w:val="110"/>
-        </w:rPr>
-        <w:t xml:space="preserve"> </w:t>
-      </w:r>
-      <w:r>
-        <w:rPr>
-          <w:w w:val="110"/>
+          <w:sz w:val="22"/>
+          <w:szCs w:val="22"/>
+        </w:rPr>
+        <w:t xml:space="preserve"> </w:t>
+      </w:r>
+      <w:r>
+        <w:rPr>
+          <w:w w:val="110"/>
+          <w:sz w:val="22"/>
+          <w:szCs w:val="22"/>
         </w:rPr>
         <w:t>hope</w:t>
       </w:r>
@@ -821,12 +946,16 @@
         <w:rPr>
           <w:spacing w:val="-3"/>
           <w:w w:val="110"/>
-        </w:rPr>
-        <w:t xml:space="preserve"> </w:t>
-      </w:r>
-      <w:r>
-        <w:rPr>
-          <w:w w:val="110"/>
+          <w:sz w:val="22"/>
+          <w:szCs w:val="22"/>
+        </w:rPr>
+        <w:t xml:space="preserve"> </w:t>
+      </w:r>
+      <w:r>
+        <w:rPr>
+          <w:w w:val="110"/>
+          <w:sz w:val="22"/>
+          <w:szCs w:val="22"/>
         </w:rPr>
         <w:t>you</w:t>
       </w:r>
@@ -834,12 +963,16 @@
         <w:rPr>
           <w:spacing w:val="-1"/>
           <w:w w:val="110"/>
-        </w:rPr>
-        <w:t xml:space="preserve"> </w:t>
-      </w:r>
-      <w:r>
-        <w:rPr>
-          <w:w w:val="110"/>
+          <w:sz w:val="22"/>
+          <w:szCs w:val="22"/>
+        </w:rPr>
+        <w:t xml:space="preserve"> </w:t>
+      </w:r>
+      <w:r>
+        <w:rPr>
+          <w:w w:val="110"/>
+          <w:sz w:val="22"/>
+          <w:szCs w:val="22"/>
         </w:rPr>
         <w:t>will</w:t>
       </w:r>
@@ -847,12 +980,16 @@
         <w:rPr>
           <w:spacing w:val="-4"/>
           <w:w w:val="110"/>
-        </w:rPr>
-        <w:t xml:space="preserve"> </w:t>
-      </w:r>
-      <w:r>
-        <w:rPr>
-          <w:w w:val="110"/>
+          <w:sz w:val="22"/>
+          <w:szCs w:val="22"/>
+        </w:rPr>
+        <w:t xml:space="preserve"> </w:t>
+      </w:r>
+      <w:r>
+        <w:rPr>
+          <w:w w:val="110"/>
+          <w:sz w:val="22"/>
+          <w:szCs w:val="22"/>
         </w:rPr>
         <w:t>find</w:t>
       </w:r>
@@ -860,12 +997,16 @@
         <w:rPr>
           <w:spacing w:val="-1"/>
           <w:w w:val="110"/>
-        </w:rPr>
-        <w:t xml:space="preserve"> </w:t>
-      </w:r>
-      <w:r>
-        <w:rPr>
-          <w:w w:val="110"/>
+          <w:sz w:val="22"/>
+          <w:szCs w:val="22"/>
+        </w:rPr>
+        <w:t xml:space="preserve"> </w:t>
+      </w:r>
+      <w:r>
+        <w:rPr>
+          <w:w w:val="110"/>
+          <w:sz w:val="22"/>
+          <w:szCs w:val="22"/>
         </w:rPr>
         <w:t>Vibrant</w:t>
       </w:r>
@@ -873,12 +1014,16 @@
         <w:rPr>
           <w:spacing w:val="24"/>
           <w:w w:val="110"/>
-        </w:rPr>
-        <w:t xml:space="preserve"> </w:t>
-      </w:r>
-      <w:r>
-        <w:rPr>
-          <w:w w:val="110"/>
+          <w:sz w:val="22"/>
+          <w:szCs w:val="22"/>
+        </w:rPr>
+        <w:t xml:space="preserve"> </w:t>
+      </w:r>
+      <w:r>
+        <w:rPr>
+          <w:w w:val="110"/>
+          <w:sz w:val="22"/>
+          <w:szCs w:val="22"/>
         </w:rPr>
         <w:t>Technology.</w:t>
       </w:r>
@@ -886,12 +1031,16 @@
         <w:rPr>
           <w:spacing w:val="12"/>
           <w:w w:val="110"/>
-        </w:rPr>
-        <w:t xml:space="preserve"> </w:t>
-      </w:r>
-      <w:r>
-        <w:rPr>
-          <w:w w:val="110"/>
+          <w:sz w:val="22"/>
+          <w:szCs w:val="22"/>
+        </w:rPr>
+        <w:t xml:space="preserve"> </w:t>
+      </w:r>
+      <w:r>
+        <w:rPr>
+          <w:w w:val="110"/>
+          <w:sz w:val="22"/>
+          <w:szCs w:val="22"/>
         </w:rPr>
         <w:t>as</w:t>
       </w:r>
@@ -899,12 +1048,16 @@
         <w:rPr>
           <w:spacing w:val="11"/>
           <w:w w:val="110"/>
-        </w:rPr>
-        <w:t xml:space="preserve"> </w:t>
-      </w:r>
-      <w:r>
-        <w:rPr>
-          <w:w w:val="110"/>
+          <w:sz w:val="22"/>
+          <w:szCs w:val="22"/>
+        </w:rPr>
+        <w:t xml:space="preserve"> </w:t>
+      </w:r>
+      <w:r>
+        <w:rPr>
+          <w:w w:val="110"/>
+          <w:sz w:val="22"/>
+          <w:szCs w:val="22"/>
         </w:rPr>
         <w:t>a</w:t>
       </w:r>
@@ -912,12 +1065,16 @@
         <w:rPr>
           <w:spacing w:val="15"/>
           <w:w w:val="110"/>
-        </w:rPr>
-        <w:t xml:space="preserve"> </w:t>
-      </w:r>
-      <w:r>
-        <w:rPr>
-          <w:w w:val="110"/>
+          <w:sz w:val="22"/>
+          <w:szCs w:val="22"/>
+        </w:rPr>
+        <w:t xml:space="preserve"> </w:t>
+      </w:r>
+      <w:r>
+        <w:rPr>
+          <w:w w:val="110"/>
+          <w:sz w:val="22"/>
+          <w:szCs w:val="22"/>
         </w:rPr>
         <w:t>place</w:t>
       </w:r>
@@ -925,12 +1082,16 @@
         <w:rPr>
           <w:spacing w:val="-2"/>
           <w:w w:val="110"/>
-        </w:rPr>
-        <w:t xml:space="preserve"> </w:t>
-      </w:r>
-      <w:r>
-        <w:rPr>
-          <w:w w:val="110"/>
+          <w:sz w:val="22"/>
+          <w:szCs w:val="22"/>
+        </w:rPr>
+        <w:t xml:space="preserve"> </w:t>
+      </w:r>
+      <w:r>
+        <w:rPr>
+          <w:w w:val="110"/>
+          <w:sz w:val="22"/>
+          <w:szCs w:val="22"/>
         </w:rPr>
         <w:t>to</w:t>
       </w:r>
@@ -938,6 +1099,8 @@
         <w:rPr>
           <w:spacing w:val="6"/>
           <w:w w:val="110"/>
+          <w:sz w:val="22"/>
+          <w:szCs w:val="22"/>
         </w:rPr>
         <w:t xml:space="preserve"> </w:t>
       </w:r>
@@ -945,6 +1108,8 @@
       <w:r>
         <w:rPr>
           <w:w w:val="110"/>
+          <w:sz w:val="22"/>
+          <w:szCs w:val="22"/>
         </w:rPr>
         <w:t>Best</w:t>
       </w:r>
@@ -953,6 +1118,8 @@
         <w:rPr>
           <w:spacing w:val="13"/>
           <w:w w:val="110"/>
+          <w:sz w:val="22"/>
+          <w:szCs w:val="22"/>
         </w:rPr>
         <w:t xml:space="preserve"> </w:t>
       </w:r>
@@ -960,6 +1127,8 @@
         <w:rPr>
           <w:spacing w:val="-4"/>
           <w:w w:val="110"/>
+          <w:sz w:val="22"/>
+          <w:szCs w:val="22"/>
         </w:rPr>
         <w:t>work</w:t>
       </w:r>
@@ -977,12 +1146,18 @@
         <w:pStyle w:val="Heading2"/>
         <w:spacing w:before="182"/>
         <w:ind w:right="9969"/>
+        <w:rPr>
+          <w:sz w:val="22"/>
+          <w:szCs w:val="22"/>
+        </w:rPr>
       </w:pPr>
       <w:r>
         <w:rPr>
           <w:color w:val="2D2D2D"/>
           <w:spacing w:val="-2"/>
           <w:w w:val="105"/>
+          <w:sz w:val="22"/>
+          <w:szCs w:val="22"/>
         </w:rPr>
         <w:t>Regards,</w:t>
       </w:r>
@@ -1195,7 +1370,8 @@
       <w:pPr>
         <w:pStyle w:val="BodyText"/>
         <w:rPr>
-          <w:sz w:val="10"/>
+          <w:sz w:val="22"/>
+          <w:szCs w:val="22"/>
         </w:rPr>
       </w:pPr>
       <w:r>
@@ -1210,13 +1386,8 @@
         <w:rPr>
           <w:b/>
           <w:w w:val="110"/>
-        </w:rPr>
-        <w:t xml:space="preserve">  </w:t>
-      </w:r>
-      <w:r>
-        <w:rPr>
-          <w:b/>
-          <w:w w:val="110"/>
+          <w:sz w:val="22"/>
+          <w:szCs w:val="22"/>
         </w:rPr>
         <w:t>Team</w:t>
       </w:r>
@@ -1225,6 +1396,8 @@
           <w:b/>
           <w:spacing w:val="5"/>
           <w:w w:val="110"/>
+          <w:sz w:val="22"/>
+          <w:szCs w:val="22"/>
         </w:rPr>
         <w:t xml:space="preserve"> </w:t>
       </w:r>
@@ -1233,6 +1406,8 @@
           <w:b/>
           <w:spacing w:val="-2"/>
           <w:w w:val="110"/>
+          <w:sz w:val="22"/>
+          <w:szCs w:val="22"/>
         </w:rPr>
         <w:t>Leader</w:t>
       </w:r>

</xml_diff>

<commit_message>
the project is complieted
</commit_message>
<xml_diff>
--- a/ALAN BIJO VARGHESE.docx
+++ b/ALAN BIJO VARGHESE.docx
@@ -469,6 +469,18 @@
         <w:rPr>
           <w:b/>
           <w:sz w:val="21"/>
+        </w:rPr>
+      </w:pPr>
+    </w:p>
+    <w:p>
+      <w:pPr>
+        <w:spacing w:before="92"/>
+        <w:ind w:left="837" w:right="891"/>
+        <w:jc w:val="center"/>
+        <w:rPr>
+          <w:b/>
+          <w:sz w:val="24"/>
+          <w:u w:val="thick"/>
         </w:rPr>
       </w:pPr>
     </w:p>
@@ -1499,6 +1511,87 @@
         <w:rPr>
           <w:sz w:val="29"/>
         </w:rPr>
+      </w:pPr>
+      <w:r>
+        <w:rPr>
+          <w:sz w:val="29"/>
+        </w:rPr>
+        <w:t xml:space="preserve">      </w:t>
+      </w:r>
+      <w:r>
+        <w:rPr>
+          <w:sz w:val="29"/>
+        </w:rPr>
+        <w:tab/>
+      </w:r>
+      <w:r>
+        <w:rPr>
+          <w:sz w:val="29"/>
+        </w:rPr>
+        <w:tab/>
+      </w:r>
+      <w:r>
+        <w:rPr>
+          <w:sz w:val="29"/>
+        </w:rPr>
+        <w:tab/>
+      </w:r>
+      <w:r>
+        <w:rPr>
+          <w:sz w:val="29"/>
+        </w:rPr>
+        <w:tab/>
+      </w:r>
+      <w:r>
+        <w:rPr>
+          <w:sz w:val="29"/>
+        </w:rPr>
+        <w:tab/>
+      </w:r>
+      <w:r>
+        <w:rPr>
+          <w:sz w:val="29"/>
+        </w:rPr>
+        <w:tab/>
+      </w:r>
+      <w:r>
+        <w:rPr>
+          <w:sz w:val="29"/>
+        </w:rPr>
+        <w:tab/>
+      </w:r>
+      <w:r>
+        <w:rPr>
+          <w:sz w:val="29"/>
+        </w:rPr>
+        <w:tab/>
+      </w:r>
+      <w:r>
+        <w:rPr>
+          <w:sz w:val="29"/>
+        </w:rPr>
+        <w:tab/>
+      </w:r>
+    </w:p>
+    <w:p>
+      <w:pPr>
+        <w:rPr>
+          <w:sz w:val="29"/>
+        </w:rPr>
+      </w:pPr>
+    </w:p>
+    <w:p>
+      <w:pPr>
+        <w:rPr>
+          <w:sz w:val="29"/>
+        </w:rPr>
+      </w:pPr>
+    </w:p>
+    <w:p>
+      <w:pPr>
+        <w:rPr>
+          <w:sz w:val="29"/>
+        </w:rPr>
         <w:sectPr>
           <w:type w:val="continuous"/>
           <w:pgSz w:w="11910" w:h="16850"/>
@@ -1506,66 +1599,6 @@
           <w:cols w:space="720"/>
         </w:sectPr>
       </w:pPr>
-      <w:r>
-        <w:rPr>
-          <w:sz w:val="29"/>
-        </w:rPr>
-        <w:t xml:space="preserve">      </w:t>
-      </w:r>
-      <w:r>
-        <w:rPr>
-          <w:sz w:val="29"/>
-        </w:rPr>
-        <w:tab/>
-      </w:r>
-      <w:r>
-        <w:rPr>
-          <w:sz w:val="29"/>
-        </w:rPr>
-        <w:tab/>
-      </w:r>
-      <w:r>
-        <w:rPr>
-          <w:sz w:val="29"/>
-        </w:rPr>
-        <w:tab/>
-      </w:r>
-      <w:r>
-        <w:rPr>
-          <w:sz w:val="29"/>
-        </w:rPr>
-        <w:tab/>
-      </w:r>
-      <w:r>
-        <w:rPr>
-          <w:sz w:val="29"/>
-        </w:rPr>
-        <w:tab/>
-      </w:r>
-      <w:r>
-        <w:rPr>
-          <w:sz w:val="29"/>
-        </w:rPr>
-        <w:tab/>
-      </w:r>
-      <w:r>
-        <w:rPr>
-          <w:sz w:val="29"/>
-        </w:rPr>
-        <w:tab/>
-      </w:r>
-      <w:r>
-        <w:rPr>
-          <w:sz w:val="29"/>
-        </w:rPr>
-        <w:tab/>
-      </w:r>
-      <w:r>
-        <w:rPr>
-          <w:sz w:val="29"/>
-        </w:rPr>
-        <w:tab/>
-      </w:r>
     </w:p>
     <w:p>
       <w:pPr>

</xml_diff>

<commit_message>
chore: update ALAN BIJO VARGHESE offer document
</commit_message>
<xml_diff>
--- a/ALAN BIJO VARGHESE.docx
+++ b/ALAN BIJO VARGHESE.docx
@@ -314,6 +314,13 @@
           <w:sz w:val="22"/>
           <w:szCs w:val="22"/>
         </w:rPr>
+        <w:t xml:space="preserve"> </w:t>
+      </w:r>
+      <w:r>
+        <w:rPr>
+          <w:sz w:val="22"/>
+          <w:szCs w:val="22"/>
+        </w:rPr>
         <w:t>ALAN</w:t>
       </w:r>
       <w:r>
@@ -361,7 +368,7 @@
           <w:sz w:val="22"/>
           <w:szCs w:val="22"/>
         </w:rPr>
-        <w:t xml:space="preserve">                                                                           </w:t>
+        <w:t xml:space="preserve">                                                                          </w:t>
       </w:r>
       <w:r>
         <w:rPr>
@@ -369,6 +376,14 @@
           <w:sz w:val="22"/>
           <w:szCs w:val="22"/>
         </w:rPr>
+        <w:t xml:space="preserve"> </w:t>
+      </w:r>
+      <w:r>
+        <w:rPr>
+          <w:w w:val="115"/>
+          <w:sz w:val="22"/>
+          <w:szCs w:val="22"/>
+        </w:rPr>
         <w:t>11/05/2026</w:t>
       </w:r>
       <w:r>
@@ -393,6 +408,7 @@
         <w:spacing w:before="73"/>
         <w:rPr>
           <w:b/>
+          <w:bCs/>
         </w:rPr>
       </w:pPr>
       <w:r>
@@ -403,12 +419,22 @@
       </w:r>
       <w:r>
         <w:rPr>
+          <w:b/>
+        </w:rPr>
+        <w:t xml:space="preserve"> </w:t>
+      </w:r>
+      <w:r>
+        <w:rPr>
+          <w:b/>
+          <w:bCs/>
           <w:w w:val="105"/>
         </w:rPr>
         <w:t>Enroll:</w:t>
       </w:r>
       <w:r>
         <w:rPr>
+          <w:b/>
+          <w:bCs/>
           <w:spacing w:val="-17"/>
           <w:w w:val="105"/>
         </w:rPr>
@@ -416,12 +442,16 @@
       </w:r>
       <w:r>
         <w:rPr>
+          <w:b/>
+          <w:bCs/>
           <w:w w:val="105"/>
         </w:rPr>
         <w:t>-</w:t>
       </w:r>
       <w:r>
         <w:rPr>
+          <w:b/>
+          <w:bCs/>
           <w:spacing w:val="36"/>
           <w:w w:val="105"/>
         </w:rPr>
@@ -429,6 +459,8 @@
       </w:r>
       <w:r>
         <w:rPr>
+          <w:b/>
+          <w:bCs/>
           <w:spacing w:val="-2"/>
           <w:w w:val="105"/>
         </w:rPr>
@@ -506,7 +538,6 @@
           <w:sz w:val="24"/>
         </w:rPr>
       </w:pPr>
-      <w:proofErr w:type="spellStart"/>
       <w:r>
         <w:rPr>
           <w:b/>
@@ -523,7 +554,6 @@
         </w:rPr>
         <w:t>p</w:t>
       </w:r>
-      <w:proofErr w:type="spellEnd"/>
       <w:r>
         <w:rPr>
           <w:b/>
@@ -604,34 +634,15 @@
           <w:sz w:val="22"/>
           <w:szCs w:val="22"/>
         </w:rPr>
-        <w:t xml:space="preserve">ALAN BIJO </w:t>
-      </w:r>
-      <w:proofErr w:type="gramStart"/>
-      <w:r>
-        <w:rPr>
-          <w:b/>
-          <w:w w:val="110"/>
-          <w:sz w:val="22"/>
-          <w:szCs w:val="22"/>
-        </w:rPr>
-        <w:t xml:space="preserve">VARGHESE </w:t>
-      </w:r>
-      <w:r>
-        <w:rPr>
-          <w:w w:val="110"/>
-          <w:sz w:val="22"/>
-          <w:szCs w:val="22"/>
-        </w:rPr>
-        <w:t>,</w:t>
-      </w:r>
-      <w:proofErr w:type="gramEnd"/>
-      <w:r>
-        <w:rPr>
-          <w:w w:val="110"/>
-          <w:sz w:val="22"/>
-          <w:szCs w:val="22"/>
-        </w:rPr>
-        <w:t xml:space="preserve"> we are pleased to offer you internship at Vibrant Technology in the</w:t>
+        <w:t xml:space="preserve">ALAN BIJO VARGHESE </w:t>
+      </w:r>
+      <w:r>
+        <w:rPr>
+          <w:w w:val="110"/>
+          <w:sz w:val="22"/>
+          <w:szCs w:val="22"/>
+        </w:rPr>
+        <w:t>, we are pleased to offer you internship at Vibrant Technology in the</w:t>
       </w:r>
       <w:r>
         <w:rPr>
@@ -1116,7 +1127,6 @@
         </w:rPr>
         <w:t xml:space="preserve"> </w:t>
       </w:r>
-      <w:proofErr w:type="gramStart"/>
       <w:r>
         <w:rPr>
           <w:w w:val="110"/>
@@ -1125,7 +1135,6 @@
         </w:rPr>
         <w:t>Best</w:t>
       </w:r>
-      <w:proofErr w:type="gramEnd"/>
       <w:r>
         <w:rPr>
           <w:spacing w:val="13"/>
@@ -1188,15 +1197,15 @@
           <w:sz w:val="29"/>
         </w:rPr>
         <w:drawing>
-          <wp:anchor distT="0" distB="0" distL="114300" distR="114300" simplePos="0" relativeHeight="251664896" behindDoc="0" locked="0" layoutInCell="1" allowOverlap="1" wp14:anchorId="4D8E1886" wp14:editId="3A36A6A6">
+          <wp:anchor distT="0" distB="0" distL="114300" distR="114300" simplePos="0" relativeHeight="251664896" behindDoc="0" locked="0" layoutInCell="1" allowOverlap="1" wp14:anchorId="4D8E1886" wp14:editId="1D3BF27F">
             <wp:simplePos x="0" y="0"/>
             <wp:positionH relativeFrom="column">
-              <wp:posOffset>668215</wp:posOffset>
+              <wp:posOffset>688061</wp:posOffset>
             </wp:positionH>
             <wp:positionV relativeFrom="paragraph">
-              <wp:posOffset>69690</wp:posOffset>
+              <wp:posOffset>146050</wp:posOffset>
             </wp:positionV>
-            <wp:extent cx="1090247" cy="819579"/>
+            <wp:extent cx="1223067" cy="919425"/>
             <wp:effectExtent l="0" t="0" r="0" b="0"/>
             <wp:wrapNone/>
             <wp:docPr id="11" name="Picture 11"/>
@@ -1225,7 +1234,7 @@
                   <pic:spPr>
                     <a:xfrm>
                       <a:off x="0" y="0"/>
-                      <a:ext cx="1096229" cy="824076"/>
+                      <a:ext cx="1223067" cy="919425"/>
                     </a:xfrm>
                     <a:prstGeom prst="rect">
                       <a:avLst/>
@@ -1243,6 +1252,15 @@
           </wp:anchor>
         </w:drawing>
       </w:r>
+    </w:p>
+    <w:p>
+      <w:pPr>
+        <w:spacing w:before="220"/>
+        <w:ind w:left="1410"/>
+        <w:rPr>
+          <w:sz w:val="29"/>
+        </w:rPr>
+      </w:pPr>
       <w:r>
         <w:rPr>
           <w:sz w:val="29"/>
@@ -1685,13 +1703,13 @@
         <w:r>
           <w:rPr>
             <w:rStyle w:val="Hyperlink"/>
-            <w:color w:val="0D0D0D" w:themeColor="text1" w:themeTint="F2"/>
+            <w:color w:val="000000" w:themeColor="text1"/>
             <w:spacing w:val="-2"/>
             <w:w w:val="125"/>
             <w:sz w:val="20"/>
             <w:szCs w:val="20"/>
           </w:rPr>
-          <w:t>info@vibrantwebtech.in</w:t>
+          <w:t>info@vibranttechnology.in</w:t>
         </w:r>
       </w:hyperlink>
     </w:p>
@@ -1950,25 +1968,7 @@
           <w:sz w:val="20"/>
           <w:szCs w:val="20"/>
         </w:rPr>
-        <w:t xml:space="preserve">, </w:t>
-      </w:r>
-      <w:proofErr w:type="spellStart"/>
-      <w:r>
-        <w:rPr>
-          <w:w w:val="120"/>
-          <w:sz w:val="20"/>
-          <w:szCs w:val="20"/>
-        </w:rPr>
-        <w:t>Ellisbridge</w:t>
-      </w:r>
-      <w:proofErr w:type="spellEnd"/>
-      <w:r>
-        <w:rPr>
-          <w:w w:val="120"/>
-          <w:sz w:val="20"/>
-          <w:szCs w:val="20"/>
-        </w:rPr>
-        <w:t>,</w:t>
+        <w:t>, Ellisbridge,</w:t>
       </w:r>
     </w:p>
     <w:p>

</xml_diff>